<commit_message>
Update the guide's default tooling list
Section 8 still listed the old six winget packages. It now describes the
current Tooling.Default.json and how to trim it before a VM's first build.

Co-Authored-By: Claude Opus 5.5 <noreply@anthropic.com>
Claude-Session: https://claude.ai/code/session_0142nMVwe5oBheSwBHpqDecZ
</commit_message>
<xml_diff>
--- a/Build-LazyVM-Guide.docx
+++ b/Build-LazyVM-Guide.docx
@@ -8977,7 +8977,7 @@
           <w:sz w:val="21"/>
           <w:szCs w:val="21"/>
         </w:rPr>
-        <w:t xml:space="preserve">: Visual Studio Community 2026 and SQL Server Management Studio 22, plus these six winget packages:</w:t>
+        <w:t xml:space="preserve">:</w:t>
       </w:r>
     </w:p>
     <w:p>
@@ -8995,16 +8995,7 @@
           <w:sz w:val="21"/>
           <w:szCs w:val="21"/>
         </w:rPr>
-        <w:t xml:space="preserve">Notepad++  —  </w:t>
-      </w:r>
-      <w:r>
-        <w:rPr>
-          <w:rFonts w:ascii="Consolas" w:cs="Consolas" w:eastAsia="Consolas" w:hAnsi="Consolas"/>
-          <w:color w:val="9C2D2D"/>
-          <w:sz w:val="19"/>
-          <w:szCs w:val="19"/>
-        </w:rPr>
-        <w:t xml:space="preserve">Notepad++.Notepad++</w:t>
+        <w:t xml:space="preserve">Visual Studio Community 2026, with the ASP.NET and web, .NET desktop, .NET MAUI, Azure, data storage and processing, data science, Python and Windows application workloads</w:t>
       </w:r>
     </w:p>
     <w:p>
@@ -9022,16 +9013,7 @@
           <w:sz w:val="21"/>
           <w:szCs w:val="21"/>
         </w:rPr>
-        <w:t xml:space="preserve">LINQPad 9  —  </w:t>
-      </w:r>
-      <w:r>
-        <w:rPr>
-          <w:rFonts w:ascii="Consolas" w:cs="Consolas" w:eastAsia="Consolas" w:hAnsi="Consolas"/>
-          <w:color w:val="9C2D2D"/>
-          <w:sz w:val="19"/>
-          <w:szCs w:val="19"/>
-        </w:rPr>
-        <w:t xml:space="preserve">LINQPad.LINQPad.9</w:t>
+        <w:t xml:space="preserve">SQL Server Management Studio 22</w:t>
       </w:r>
     </w:p>
     <w:p>
@@ -9049,16 +9031,7 @@
           <w:sz w:val="21"/>
           <w:szCs w:val="21"/>
         </w:rPr>
-        <w:t xml:space="preserve">JetBrains dotPeek  —  </w:t>
-      </w:r>
-      <w:r>
-        <w:rPr>
-          <w:rFonts w:ascii="Consolas" w:cs="Consolas" w:eastAsia="Consolas" w:hAnsi="Consolas"/>
-          <w:color w:val="9C2D2D"/>
-          <w:sz w:val="19"/>
-          <w:szCs w:val="19"/>
-        </w:rPr>
-        <w:t xml:space="preserve">JetBrains.dotPeek</w:t>
+        <w:t xml:space="preserve">Visual Studio extensions: EF Core Power Tools, SQLite and SQL Server Compact Toolbox, Template Studio for WinUI, XAML Styler and four colour themes</w:t>
       </w:r>
     </w:p>
     <w:p>
@@ -9076,16 +9049,7 @@
           <w:sz w:val="21"/>
           <w:szCs w:val="21"/>
         </w:rPr>
-        <w:t xml:space="preserve">ILSpy  —  </w:t>
-      </w:r>
-      <w:r>
-        <w:rPr>
-          <w:rFonts w:ascii="Consolas" w:cs="Consolas" w:eastAsia="Consolas" w:hAnsi="Consolas"/>
-          <w:color w:val="9C2D2D"/>
-          <w:sz w:val="19"/>
-          <w:szCs w:val="19"/>
-        </w:rPr>
-        <w:t xml:space="preserve">icsharpcode.ILSpy</w:t>
+        <w:t xml:space="preserve">Tools from winget: Git, GitHub CLI, GitHub Desktop, Visual Studio Code, Windows Terminal, PowerShell 7, WSL, LINQPad 9, Notepad++, WinMerge and 7-Zip</w:t>
       </w:r>
     </w:p>
     <w:p>
@@ -9103,7 +9067,20 @@
           <w:sz w:val="21"/>
           <w:szCs w:val="21"/>
         </w:rPr>
-        <w:t xml:space="preserve">7-Zip  —  </w:t>
+        <w:t xml:space="preserve">SDKs and runtimes from winget: the Windows SDK, the SQL Server ODBC and OLE DB drivers, System CLR Types, the Visual C++ redistributables and Web Deploy</w:t>
+      </w:r>
+    </w:p>
+    <w:p>
+      <w:pPr>
+        <w:spacing w:after="120" w:before="0" w:line="276"/>
+      </w:pPr>
+      <w:r>
+        <w:rPr>
+          <w:rFonts w:ascii="Calibri" w:cs="Calibri" w:eastAsia="Calibri" w:hAnsi="Calibri"/>
+          <w:sz w:val="21"/>
+          <w:szCs w:val="21"/>
+        </w:rPr>
+        <w:t xml:space="preserve">To give a VM less, copy </w:t>
       </w:r>
       <w:r>
         <w:rPr>
@@ -9112,25 +9089,15 @@
           <w:sz w:val="19"/>
           <w:szCs w:val="19"/>
         </w:rPr>
-        <w:t xml:space="preserve">7zip.7zip</w:t>
-      </w:r>
-    </w:p>
-    <w:p>
-      <w:pPr>
-        <w:pStyle w:val="ListParagraph"/>
-        <w:numPr>
-          <w:ilvl w:val="0"/>
-          <w:numId w:val="2"/>
-        </w:numPr>
-        <w:spacing w:after="80" w:line="276"/>
-      </w:pPr>
-      <w:r>
-        <w:rPr>
-          <w:rFonts w:ascii="Calibri" w:cs="Calibri" w:eastAsia="Calibri" w:hAnsi="Calibri"/>
-          <w:sz w:val="21"/>
-          <w:szCs w:val="21"/>
-        </w:rPr>
-        <w:t xml:space="preserve">WinMerge  —  </w:t>
+        <w:t xml:space="preserve">Config\Tooling.Default.json</w:t>
+      </w:r>
+      <w:r>
+        <w:rPr>
+          <w:rFonts w:ascii="Calibri" w:cs="Calibri" w:eastAsia="Calibri" w:hAnsi="Calibri"/>
+          <w:sz w:val="21"/>
+          <w:szCs w:val="21"/>
+        </w:rPr>
+        <w:t xml:space="preserve"> to </w:t>
       </w:r>
       <w:r>
         <w:rPr>
@@ -9139,7 +9106,15 @@
           <w:sz w:val="19"/>
           <w:szCs w:val="19"/>
         </w:rPr>
-        <w:t xml:space="preserve">WinMerge.WinMerge</w:t>
+        <w:t xml:space="preserve">Config\VMs\&lt;Name&gt;\Tooling.json</w:t>
+      </w:r>
+      <w:r>
+        <w:rPr>
+          <w:rFonts w:ascii="Calibri" w:cs="Calibri" w:eastAsia="Calibri" w:hAnsi="Calibri"/>
+          <w:sz w:val="21"/>
+          <w:szCs w:val="21"/>
+        </w:rPr>
+        <w:t xml:space="preserve"> before its first build and remove what you don't need. Edit the copy, not the default list, which is replaced when the script is updated.</w:t>
       </w:r>
     </w:p>
     <w:p>

</xml_diff>